<commit_message>
Fase 3: responsables de las entregas de WEB-09/11, del respaldo de cierre y del aviso de WEB-12
- Brayan valida las entregas de sus dos pedidos del flujo B (mensaje, LEEME y MU-06)
- Alberto saca el respaldo de cierre cuando Jemima avisa
- Jemima avisa en el grupo al terminar WEB-12; con eso arranca el BI
</commit_message>
<xml_diff>
--- a/Entrega_Fase3_Grupo14/2_Manuales_Usuario/MU-06_CRM_en_el_sitio_y_BI_PLANTILLA.docx
+++ b/Entrega_Fase3_Grupo14/2_Manuales_Usuario/MU-06_CRM_en_el_sitio_y_BI_PLANTILLA.docx
@@ -1027,6 +1027,54 @@
         <w:pStyle w:val="Ttulo2"/>
       </w:pPr>
       <w:r>
+        <w:t>Validar la entrega y revisar la factura</w:t>
+      </w:r>
+    </w:p>
+    <w:p>
+      <w:r>
+        <w:rPr>
+          <w:b/>
+        </w:rPr>
+        <w:t xml:space="preserve">Ruta: </w:t>
+      </w:r>
+      <w:r>
+        <w:t>Inventario › Entregas › Validar; Facturación › Facturas de clientes</w:t>
+      </w:r>
+    </w:p>
+    <w:p>
+      <w:r>
+        <w:rPr>
+          <w:i/>
+          <w:color w:val="808080"/>
+        </w:rPr>
+        <w:t>Qué se hace en este paso y qué se ve al terminar.</w:t>
+      </w:r>
+    </w:p>
+    <w:p>
+      <w:pPr>
+        <w:keepNext/>
+      </w:pPr>
+      <w:r>
+        <w:rPr>
+          <w:i/>
+          <w:color w:val="808080"/>
+        </w:rPr>
+        <w:t>[Captura: Entrega hecha y factura pagada]</w:t>
+      </w:r>
+    </w:p>
+    <w:p>
+      <w:pPr>
+        <w:jc w:val="center"/>
+      </w:pPr>
+      <w:r>
+        <w:t>Figura __. Validar la entrega y revisar la factura. Elaboración propia.</w:t>
+      </w:r>
+    </w:p>
+    <w:p>
+      <w:pPr>
+        <w:pStyle w:val="Ttulo2"/>
+      </w:pPr>
+      <w:r>
         <w:t>Validación del capítulo 1</w:t>
       </w:r>
     </w:p>

</xml_diff>